<commit_message>
Finalize PLOS ONE submission checks and upload files
Document verified data-access dates, move competing interests to submission fields, and prepare the official human-participants checklist with the remaining author fact explicitly marked. Preserve scientific results and package the verified manuscript, figures, supporting data, and audit records.
</commit_message>
<xml_diff>
--- a/manuscript/plos_one_innovation_20261017/PLOS_ONE_Manuscript_Reading.docx
+++ b/manuscript/plos_one_innovation_20261017/PLOS_ONE_Manuscript_Reading.docx
@@ -664,7 +664,7 @@
         <w:widowControl/>
       </w:pPr>
       <w:r>
-        <w:t xml:space="preserve">The study used existing, coded participant records. Original collection approval and consent and the institutional secondary-use confirmation are documented separately in S2 Text.</w:t>
+        <w:t xml:space="preserve">Dataset metadata were accessed on 10 October 2026, and the selected EEG recordings and accompanying metadata were retrieved on 11 October 2026. This secondary analysis used the released coded participant identifiers; no participants were contacted and no re-identification was attempted. Original collection approval and consent and the institutional secondary-use confirmation are documented separately in S2 Text.</w:t>
       </w:r>
     </w:p>
     <w:bookmarkEnd w:id="22"/>
@@ -5880,7 +5880,7 @@
           <w:color w:val="000000"/>
           <w:sz w:val="28"/>
         </w:rPr>
-        <w:t xml:space="preserve">Author contributions and declarations</w:t>
+        <w:t xml:space="preserve">Author contributions</w:t>
       </w:r>
     </w:p>
     <w:p>
@@ -5890,15 +5890,6 @@
       </w:pPr>
       <w:r>
         <w:t xml:space="preserve">Ziyuan Zhu: Conceptualization; Methodology; Software; Formal analysis; Validation; Visualization; Writing – original draft; Writing – review &amp; editing.</w:t>
-      </w:r>
-    </w:p>
-    <w:p>
-      <w:pPr>
-        <w:pStyle w:val="BodyText"/>
-        <w:widowControl/>
-      </w:pPr>
-      <w:r>
-        <w:t xml:space="preserve">The author declares no competing interests.</w:t>
       </w:r>
     </w:p>
     <w:bookmarkEnd w:id="67"/>

</xml_diff>

<commit_message>
Revise PLOS ethics basis and address targeted manuscript comments
Replace current institutional-confirmation wording with the Article 32(1) regulatory exemption basis across the manuscript, supplements, checklist and submission materials. Clarify the fixed cohort split, reliability probes, statistical checks and interpretation; update Figure 4 labels and the codebook reference. Preserve all original result values and scientific data, remove repeated caption disclosures, and regenerate the verified Word, PDF and submission archives.
</commit_message>
<xml_diff>
--- a/manuscript/plos_one_innovation_20261017/PLOS_ONE_Manuscript_Reading.docx
+++ b/manuscript/plos_one_innovation_20261017/PLOS_ONE_Manuscript_Reading.docx
@@ -118,7 +118,7 @@
         <w:widowControl/>
       </w:pPr>
       <w:r>
-        <w:t xml:space="preserve">Short calibration runs force longitudinal EEG decoders to learn from few new labels. We quantified the value of updating the spatial representation after accounting for classifier recalibration and examined the prediction changes producing that value. Using Kumar2024, we compared frozen common spatial patterns and linear discriminant analysis (CSP/LDA), LDA-only recalibration, and full CSP/LDA refitting across 18 participants and six sessions. Both updating methods used the same 40 source labels and 19 or 20 current-session labels. Six predefined participants formed the development group and 12 the primary cohort. In the primary cohort, full refitting achieved 65.36% balanced accuracy, exceeding frozen decoding by 7.42 percentage points (95% participant-bootstrap interval 2.49–12.48) and LDA-only recalibration by 5.47 points (2.17–8.91). The latter accounted for 73.7% of the mean total gain. An additional prediction-transition analysis resolved this component gain into 16.04 points of corrected errors and 10.57 points of newly introduced errors. Mean left- and right-class recall increased by 6.16 and 4.78 points, respectively. The component gain was positive in ten of 12 participant averages, in each of the five target-session cohort averages, and across all single-participant deletion summaries. Development measurements distinguished calibration-subset agreement from correct task-score orientation: nine of 30 support sessions had opposite orientations between halves. Chronological evaluation, participant-level inference, amplitude sensitivity and complete neural-reference histories supported the comparisons. Spatial-filter refitting therefore contributed most of the observed recalibration gain under matched labels, with mean recall improvements in both classes. The findings identify update location and calibration-measurement direction as concrete targets for efficient longitudinal EEG recalibration.</w:t>
+        <w:t xml:space="preserve">Short calibration runs force longitudinal EEG decoders to learn from few new labels. We quantified the value of updating the spatial representation after accounting for classifier recalibration and examined the prediction changes producing that value. Using Kumar2024, we compared frozen common spatial patterns and linear discriminant analysis (CSP/LDA), LDA-only recalibration, and full CSP/LDA refitting across 18 participants and six sessions. Both updating methods used the same 40 source labels and 19 or 20 current-session labels. Six predefined participants formed the development group and 12 the primary cohort. In the primary cohort, full refitting achieved 65.36% balanced accuracy, exceeding frozen decoding by 7.42 percentage points (95% participant-bootstrap interval 2.49–12.48) and LDA-only recalibration by 5.47 points (2.17–8.91). The latter accounted for 73.7% of the mean total gain. An additional prediction-transition analysis resolved this component gain into 16.04 points of corrected errors and 10.57 points of newly introduced errors. Mean left- and right-class recall increased by 6.16 and 4.78 points, respectively. The component gain was positive in ten of 12 primary participant averages, in all five target-session cohort averages and in every single-participant deletion summary. The secondary all-18 summary favored full refitting by 3.26 points over LDA-only and 6.03 over freezing. Development measurements distinguished calibration-subset agreement from correct task-score orientation: nine of 30 support sessions had opposite orientations between halves. Chronological evaluation, participant-level inference, amplitude sensitivity and complete neural-reference histories supported the comparisons. Spatial-filter refitting therefore contributed most of the observed recalibration gain under matched labels, with mean recall improvements in both classes. The findings identify update location and calibration-measurement direction as concrete targets for efficient longitudinal EEG recalibration.</w:t>
       </w:r>
     </w:p>
     <w:bookmarkEnd w:id="20"/>
@@ -619,7 +619,7 @@
         <w:widowControl/>
       </w:pPr>
       <w:r>
-        <w:t xml:space="preserve">For this secondary analysis, the research administration office at Chongqing Medical University confirmed on 16 October 2026 an exemption from additional ethical review under Article 32, item (1), of China’s</w:t>
+        <w:t xml:space="preserve">This secondary analysis was exempt from additional ethical review under Article 32, item (1), of China’s</w:t>
       </w:r>
       <w:r>
         <w:t xml:space="preserve"> </w:t>
@@ -655,7 +655,7 @@
         <w:t xml:space="preserve">]</w:t>
       </w:r>
       <w:r>
-        <w:t xml:space="preserve">. The confirmation, recorded through the author’s report, covered lawfully obtained public data under the provision’s conditions concerning harm, sensitive personal information and commercial interests. It carried no reference number.</w:t>
+        <w:t xml:space="preserve">. It used lawfully obtained publicly available data, caused no harm to participants, and did not involve sensitive personal information or commercial interests.</w:t>
       </w:r>
     </w:p>
     <w:p>
@@ -664,7 +664,7 @@
         <w:widowControl/>
       </w:pPr>
       <w:r>
-        <w:t xml:space="preserve">Dataset metadata were accessed on 10 October 2026, and the selected EEG recordings and accompanying metadata were retrieved on 11 October 2026. This secondary analysis used the released coded participant identifiers; no participants were contacted and no re-identification was attempted. The author had no access to information that could identify individual participants during or after data collection. Original collection approval and consent and the institutional secondary-use confirmation are documented separately in S2 Text.</w:t>
+        <w:t xml:space="preserve">Dataset metadata were accessed on 10 October 2026, and the selected EEG recordings and accompanying metadata were retrieved on 11 October 2026. This secondary analysis used the released coded participant identifiers; no participants were contacted and no re-identification was attempted. The author had no access to information that could identify individual participants during or after data collection. Original collection approval and consent and the regulatory basis for this secondary analysis are documented separately in S2 Text.</w:t>
       </w:r>
     </w:p>
     <w:bookmarkEnd w:id="22"/>
@@ -748,7 +748,7 @@
         <w:widowControl/>
       </w:pPr>
       <w:r>
-        <w:t xml:space="preserve">Participants sub-1, 4, 7, 10, 13 and 16 formed the development group. The remaining 12 formed the predefined primary cohort, allocated by numeric identifier before examination of these results. In session 0, runs 0 and 1 supplied 40 source training windows, run 2 supplied 20 source-validation windows, and run 3 supplied source query. In each of five later sessions, run 0 supplied support and the remaining whole runs supplied query.</w:t>
+        <w:t xml:space="preserve">Participants sub-1, 4, 7, 10, 13 and 16, selected at every third numeric identifier, formed the predefined development group for calibration-reliability probes and pipeline verification. The remaining 12 formed the predefined primary cohort. Both cohorts used the same fixed four-component CSP, Ledoit–Wolf regularization and automatic-shrinkage LDA configuration; the primary-cohort results were not used to tune these settings. In session 0, runs 0 and 1 supplied 40 source training windows, run 2 supplied 20 source-validation windows, and run 3 supplied source query. In each of five later sessions, run 0 supplied support and the remaining whole runs supplied query.</w:t>
       </w:r>
     </w:p>
     <w:p>
@@ -1608,7 +1608,7 @@
         <w:widowControl/>
       </w:pPr>
       <w:r>
-        <w:t xml:space="preserve">The two CPU update methods share the adaptation budget. Their comparison with freezing measures the benefit of adding support labels and refitting the specified components. EEGNet supplies a source-only neural reference with the additional validation budget shown in Table 1. S1 Text, S3 gives the complete implementation settings.</w:t>
+        <w:t xml:space="preserve">The two CPU update methods share the adaptation budget. Their comparison with freezing measures the benefit of adding support labels and refitting the specified components. Frozen EEGNet supplies a source-only neural reference with the additional validation budget shown in Table 1. Target-session neural fine-tuning would add layer-freezing and learning-rate choices for 19 or 20 support trials; retaining the frozen reference keeps the adaptation comparison focused on the CSP and LDA stages. S1 Text, S3 gives the complete implementation settings.</w:t>
       </w:r>
     </w:p>
     <w:bookmarkEnd w:id="25"/>
@@ -1652,7 +1652,7 @@
         <w:widowControl/>
       </w:pPr>
       <w:r>
-        <w:t xml:space="preserve">The original endpoint hierarchy and cohort allocation preceded the reported results. Later QC, influence and post-review statistical checks were exploratory after inspection of those results. The latter checks enumerated all</w:t>
+        <w:t xml:space="preserve">The original endpoint hierarchy and cohort allocation preceded the reported results. Amplitude-QC sensitivity, participant-influence and exact sign-flip checks were post-hoc exploratory analyses conducted after inspection of those results. The latter checks enumerated all</w:t>
       </w:r>
       <w:r>
         <w:t xml:space="preserve"> </w:t>
@@ -1765,7 +1765,7 @@
         <w:widowControl/>
       </w:pPr>
       <w:r>
-        <w:t xml:space="preserve">We assessed two measures of session change relative to source query. The task-axis measure used the source-trained, normalized difference between class means in standardized 44-dimensional mu/beta log-power coordinates; one-dimensional Wasserstein distance measured change along this axis. The covariance-shape measure used a source-training Riemannian reference in a fixed 21-dimensional common-average-reference basis, with trace normalization and fixed shrinkage. It captures normalized covariance shape. Target labels entered the BA outcome, while the drift predictors used the corresponding signal distributions.</w:t>
+        <w:t xml:space="preserve">We assessed whether signal-distribution changes tracked changes in frozen-decoder BA. The task-axis measure was the one-dimensional Wasserstein distance between source-query and target-query projections onto the source-trained, normalized right-minus-left class direction in standardized 44-dimensional mu/beta log-power coordinates (8–13 and 13–30 Hz). For covariance-shape drift, each epoch’s covariance matrix was trace-normalized and shrinkage-regularized in a fixed 21-dimensional common-average-reference basis. We subtracted the source-query mean Riemannian distance to the source-training reference from the target-query mean distance to that same reference. Both predictors used target signals without target labels; labels entered the BA outcome.</w:t>
       </w:r>
     </w:p>
     <w:p>
@@ -1774,7 +1774,7 @@
         <w:widowControl/>
       </w:pPr>
       <w:r>
-        <w:t xml:space="preserve">The outcome was target-minus-source frozen-decoder BA. Associations pooled within- and between-participant variation and shared a source-query reference across each participant’s five target sessions. The participant-block bootstrap preserved that clustering. These query-distribution associations served as retrospective descriptions.</w:t>
+        <w:t xml:space="preserve">The outcome was target-minus-source frozen-decoder BA across the primary cohort’s 60 target sessions. Spearman associations pooled within- and between-participant variation and shared a source-query reference across each participant’s five target sessions. We used 2,000 participant-block bootstrap resamples to preserve that clustering. These query-distribution associations were descriptive analyses, separate from update-policy selection.</w:t>
       </w:r>
     </w:p>
     <w:p>
@@ -1783,7 +1783,7 @@
         <w:widowControl/>
       </w:pPr>
       <w:r>
-        <w:t xml:space="preserve">Development-only reliability probes used source training and current support. Fixed power, PCA and supervised CSP-score measurements were evaluated using source-run grouping, chronological support halves and cyclic-label controls. Each source-run probe trained on one 20-event run and evaluated the other, then reversed the roles. All learned transformations, including CSP and LDA, were fitted within the training fold.</w:t>
+        <w:t xml:space="preserve">Development-only reliability probes used source training and current support to examine the task information available from short calibration runs. Three low-dimensional probes used standardized 44-dimensional mu/beta log power, four source-fitted principal components, or six C3/Cz/C4 mu/beta coordinates, each classified using the right-minus-left class-centroid axis and midpoint threshold. A fourth probe used supervised four-component CSP/LDA. Each source-run probe trained on one 20-event run and evaluated the other, then reversed the roles. Standardization, PCA, CSP and LDA were fitted within the training fold as applicable.</w:t>
       </w:r>
     </w:p>
     <w:p>
@@ -1792,7 +1792,16 @@
         <w:widowControl/>
       </w:pPr>
       <w:r>
-        <w:t xml:space="preserve">Support measurements used the source models fitted on 40 training events, with source-fitted coordinate scales. Each class was divided into chronological halves within the support run. Vector cosines and signed source-score contrasts measured agreement and class orientation. Cyclic controls enumerated prescribed label phases within run grouping and were interpreted as alignment sensitivities. All 240 supervised fold/rotation pipelines were retained. S1 Text, S4–S6 specifies half sizes, score orientation, controls and degenerate cases.</w:t>
+        <w:t xml:space="preserve">For the supervised cyclic-label controls, each of six participants contributed two source-run folds and 20 training-label rotations, giving 6 × 2 × 20 = 240 fitted CSP/LDA pipelines. Held-out label rotations entered scoring only, yielding all 20 × 20 joint label-phase pairs per participant. These controls measured sensitivity to label alignment.</w:t>
+      </w:r>
+    </w:p>
+    <w:p>
+      <w:pPr>
+        <w:pStyle w:val="BodyText"/>
+        <w:widowControl/>
+      </w:pPr>
+      <w:r>
+        <w:t xml:space="preserve">Support measurements retained the models fitted on 40 source-training events. Within each of the 30 development target-support runs, each class was divided chronologically into first and second halves. The cosine between their right-minus-left vectors measured agreement in the four-dimensional CSP log-power space standardized on source training. Signed task orientation was the mean right-minus-left frozen LDA score within each half divided by twice the source-training score standard deviation. Positive values indicated the source class orientation and negative values its reversal. Source transforms and score scales remained fixed. S1 Text, S4–S6 specifies half sizes, controls and degenerate cases.</w:t>
       </w:r>
     </w:p>
     <w:bookmarkEnd w:id="28"/>
@@ -2742,7 +2751,7 @@
           <w:color w:val="000000"/>
           <w:sz w:val="21"/>
         </w:rPr>
-        <w:t xml:space="preserve">(A) Six development participants. (B) Twelve primary participants. Each colored point represents one participant’s mean BA over five target sessions; faint lines connect the same participant across methods. EEGNet averages three seeds within session. Diamonds and bars show cohort means and 95% participant-bootstrap intervals (10,000 resamples, seed 42). All methods were evaluated on the same query identities. The two CPU updating methods used identical source-training and current-support labels; the other information budgets are given in Table 1. Figure preparation used OpenAI ChatGPT/Codex assistance with the saved numerical inputs.</w:t>
+        <w:t xml:space="preserve">(A) Six development participants. (B) Twelve primary participants. Each colored point represents one participant’s mean BA over five target sessions; faint lines connect the same participant across methods. EEGNet averages three seeds within session. Diamonds and bars show cohort means and 95% participant-bootstrap intervals (10,000 resamples, seed 42). All methods were evaluated on the same query identities. The two CPU updating methods used identical source-training and current-support labels; the other information budgets are given in Table 1.</w:t>
       </w:r>
     </w:p>
     <w:bookmarkEnd w:id="35"/>
@@ -2851,7 +2860,7 @@
           <w:color w:val="000000"/>
           <w:sz w:val="21"/>
         </w:rPr>
-        <w:t xml:space="preserve">Each value is a participant’s mean paired BA difference across five target sessions. Participants appear in numeric order. Nine differences are positive and three negative, with a cohort mean of +7.42 percentage points and a 95% participant-bootstrap interval of +2.49 to +12.48. Full refitting used 19/20 current-session support labels in addition to the 40 source training labels. The figure displays observed individual differences; statistical checks concern participant-level cohort contrasts. Figure preparation used OpenAI ChatGPT/Codex assistance with the saved numerical inputs.</w:t>
+        <w:t xml:space="preserve">Each value is a participant’s mean paired BA difference across five target sessions. Participants appear in numeric order. Nine differences are positive and three negative, with a cohort mean of +7.42 percentage points and a 95% participant-bootstrap interval of +2.49 to +12.48. Full refitting used 19/20 current-session support labels in addition to the 40 source training labels. The figure displays observed individual differences; statistical checks concern participant-level cohort contrasts.</w:t>
       </w:r>
     </w:p>
     <w:p>
@@ -3445,7 +3454,7 @@
         <w:widowControl/>
       </w:pPr>
       <w:r>
-        <w:t xml:space="preserve">In the primary cohort, the Spearman associations of covariance-shape change and source-task-axis Wasserstein distance with frozen BA change were −0.007 (−0.505–0.438) and 0.197 (−0.240–0.518), respectively. These measures summarize the relation between signal-distribution change and frozen-decoder performance.</w:t>
+        <w:t xml:space="preserve">In the primary cohort, covariance-shape drift and task-axis Wasserstein distance had Spearman associations of −0.007 (95% interval −0.505 to 0.438) and 0.197 (−0.240 to 0.518) with target-minus-source frozen BA change. These estimates did not establish a reliable relationship between either fixed drift summary and frozen-decoder performance loss.</w:t>
       </w:r>
     </w:p>
     <w:p>
@@ -3454,7 +3463,7 @@
         <w:widowControl/>
       </w:pPr>
       <w:r>
-        <w:t xml:space="preserve">Development power, PCA and motor-band probes achieved mean source BA of 51.67%, 50.00% and 54.17%, with intervals including 50%. Supervised CSP/LDA source-run probes achieved 62.9167% (52.5–71.6667). The participant-averaged support-vector cosine was 0.295325 (0.032041–0.573003). Signed scores separated two properties of short-run calibration: agreement between subsets and class orientation relative to the source decoder. Among 30 support sessions, both half-contrasts were positive in 19, both were negative in two, and the signs differed in nine (Fig 3). Five support sessions had single-class source-score predictions. The two double-negative sessions demonstrate that agreement can coexist with reversed class orientation; the nine opposite-sign sessions identify changes in the sampled direction. Both quantities are needed to characterize the task information available from a short support run.</w:t>
+        <w:t xml:space="preserve">The development source-run probes using standardized power, PCA and C3/Cz/C4 motor-band coordinates achieved mean BA of 51.67%, 50.00% and 54.17%, respectively, with all 95% intervals including 50%. Supervised CSP/LDA achieved 62.92% (52.50–71.67). The participant-averaged cosine between support-half vectors in the source-standardized CSP space was 0.295 (0.032–0.573). Among 30 support sessions, both signed LDA half-margins were positive in 19, both were negative in two, and the signs differed in nine (Fig 3). Five support sessions had single-class source-score predictions. The double-negative sessions show that agreement can coexist with reversed class orientation; the opposite-sign sessions show that the estimated orientation can change within a 19- or 20-trial support run. Subset agreement and class orientation therefore describe distinct aspects of calibration reliability.</w:t>
       </w:r>
     </w:p>
     <w:p>
@@ -3537,7 +3546,7 @@
           <w:color w:val="000000"/>
           <w:sz w:val="21"/>
         </w:rPr>
-        <w:t xml:space="preserve">Each development participant contributes five target support sessions. Circles and squares represent the first and second halves within class. Values are class-balanced contrasts of frozen source-LDA scores divided by twice their source-score standard deviation. The shared zero line separates positive and reversed class orientation. Nineteen sessions have two positive margins, two have two negative margins and nine have opposite signs. The analysis uses source/support data to describe calibration-measurement reliability. Figure preparation used OpenAI ChatGPT/Codex assistance with the saved numerical inputs.</w:t>
+        <w:t xml:space="preserve">Each development participant contributes five target support sessions. Circles and squares represent the first and second halves within class. Values are class-balanced contrasts of frozen source-LDA scores divided by twice their source-score standard deviation. The shared zero line separates positive and reversed class orientation. Nineteen sessions have two positive margins, two have two negative margins and nine have opposite signs. The analysis uses source/support data to describe calibration-measurement reliability.</w:t>
       </w:r>
     </w:p>
     <w:bookmarkEnd w:id="44"/>
@@ -3646,7 +3655,7 @@
           <w:color w:val="000000"/>
           <w:sz w:val="21"/>
         </w:rPr>
-        <w:t xml:space="preserve">Cells show BA differences on identical query trials: (A) full refitting minus freezing and (B) full refitting minus LDA-only recalibration. Both panels include 18 participants and five target sessions. A horizontal line separates development and primary cohorts. Participants remain in numeric order within each cohort. The symmetric color scale is shared, and values are displayed in percentage points to one decimal. Exact differences and query counts are supplied in the figure source-data CSV. Participant-level averages define the inferential endpoints. Figure preparation used OpenAI ChatGPT/Codex assistance with the saved numerical inputs.</w:t>
+        <w:t xml:space="preserve">Cells show BA differences on identical query trials: (A) full refitting minus freezing and (B) full refitting minus LDA-only recalibration. Both panels include 18 participants and five target sessions. A horizontal line separates development and primary cohorts. Participants remain in numeric order within each cohort. The symmetric color scale is shared, and values are displayed in percentage points to one decimal. Exact differences and query counts are supplied in the figure source-data CSV. Participant-level averages define the inferential endpoints.</w:t>
       </w:r>
     </w:p>
     <w:p>
@@ -4188,7 +4197,7 @@
         <w:widowControl/>
       </w:pPr>
       <w:r>
-        <w:t xml:space="preserve">The post-review sign-flip checks are summarized in Table 5. The matched-label component contrast had an unadjusted two-sided p value of 0.01025 and a four-comparison Holm value of 0.04102. The primary total-gain contrast had corresponding values of 0.01953 and 0.05859. Table 5 presents the complete four-contrast family in its original order.</w:t>
+        <w:t xml:space="preserve">The supplementary exact sign-flip checks are summarized in Table 5. The matched-label component contrast had an unadjusted two-sided p value of 0.01025 and a four-comparison Holm-adjusted value of 0.04102. The primary total-gain contrast had corresponding values of 0.01953 and 0.05859. Table 5 presents the complete four-contrast family in its original order.</w:t>
       </w:r>
     </w:p>
     <w:p>
@@ -4203,7 +4212,7 @@
           <w:bCs/>
           <w:b/>
         </w:rPr>
-        <w:t xml:space="preserve">Table 5. Post-review exploratory participant-level sign-flip checks.</w:t>
+        <w:t xml:space="preserve">Table 5. Post-hoc exploratory participant-level exact sign-flip checks.</w:t>
       </w:r>
     </w:p>
     <w:tbl>
@@ -4382,7 +4391,7 @@
                 <w:color w:val="000000"/>
                 <w:sz w:val="21"/>
               </w:rPr>
-              <w:t xml:space="preserve">Full refit − frozen, original primary cohort</w:t>
+              <w:t xml:space="preserve">Full refit – frozen, original primary cohort</w:t>
             </w:r>
           </w:p>
         </w:tc>
@@ -4499,7 +4508,7 @@
                 <w:color w:val="000000"/>
                 <w:sz w:val="21"/>
               </w:rPr>
-              <w:t xml:space="preserve">Full refit − LDA-only, same primary cohort</w:t>
+              <w:t xml:space="preserve">Full refit – LDA-only, same primary cohort</w:t>
             </w:r>
           </w:p>
         </w:tc>
@@ -4616,7 +4625,7 @@
                 <w:color w:val="000000"/>
                 <w:sz w:val="21"/>
               </w:rPr>
-              <w:t xml:space="preserve">LDA-only − frozen, same primary cohort</w:t>
+              <w:t xml:space="preserve">LDA-only – frozen, same primary cohort</w:t>
             </w:r>
           </w:p>
         </w:tc>
@@ -4733,7 +4742,7 @@
                 <w:color w:val="000000"/>
                 <w:sz w:val="21"/>
               </w:rPr>
-              <w:t xml:space="preserve">Full refit − frozen, unflagged eligible subset</w:t>
+              <w:t xml:space="preserve">Full refit – frozen, unflagged eligible subset</w:t>
             </w:r>
           </w:p>
         </w:tc>
@@ -4829,7 +4838,24 @@
         <w:widowControl/>
       </w:pPr>
       <w:r>
-        <w:t xml:space="preserve">All sign assignments were enumerated using the stated numerical tolerance. The unflagged ten-person contrast had a positive percentile-bootstrap interval and an unadjusted sign-flip p value of 0.07617; the interval and test use different reference constructions. These exploratory checks complement the effect estimates and their uncertainty.</w:t>
+        <w:t xml:space="preserve">All </w:t>
+      </w:r>
+      <m:oMath>
+        <m:sSup>
+          <m:e>
+            <m:r>
+              <m:t>2</m:t>
+            </m:r>
+          </m:e>
+          <m:sup>
+            <m:r>
+              <m:t>n</m:t>
+            </m:r>
+          </m:sup>
+        </m:sSup>
+      </m:oMath>
+      <w:r>
+        <w:t xml:space="preserve"> sign assignments were enumerated using the stated numerical tolerance. The percentile-bootstrap intervals summarize paired participant resampling, whereas the exact tests use a sign-symmetric null distribution and Holm adjustment addresses the four-contrast family, including the overlapping 12- and ten-participant sets. These distinct reference constructions explain why an interval excluding zero need not correspond to a Holm-adjusted p value below 0.05. For the unflagged ten-person contrast, the 95% bootstrap interval was 0.99–11.24 points and the unadjusted sign-flip p value was 0.07617.</w:t>
       </w:r>
     </w:p>
     <w:bookmarkEnd w:id="49"/>
@@ -4938,7 +4964,7 @@
           <w:color w:val="000000"/>
           <w:sz w:val="21"/>
         </w:rPr>
-        <w:t xml:space="preserve">Rows show the primary cohort (12 participants), development cohort (six), and their all-participant union (18). (A, C, E) Blue bars show class-balanced correction contributions and hatched orange bars show introduced errors with negative sign; their sum is the net BA change. Diamonds and bars indicate the net means and 95% participant-bootstrap intervals. (B, D, F) Left- and right-class recall changes use the same weighting. All three contrasts are displayed. Each participant contributes the equal mean of five target sessions; intervals use 10,000 resamples with seed 42. These are exploratory analyses of saved predictions. Figure preparation used OpenAI ChatGPT/Codex assistance and checked numerical inputs.</w:t>
+        <w:t xml:space="preserve">Rows show the primary cohort (12 participants), development cohort (six), and their all-participant union (18). (A, C, E) Blue bars show class-balanced correction contributions and hatched orange bars show introduced errors with negative sign; their sum is the net BA change. Diamonds and bars indicate the net means and 95% participant-bootstrap intervals. (B, D, F) Left- and right-class recall changes use the same weighting. All three contrasts are displayed. Each participant contributes the equal mean of five target sessions; intervals use 10,000 resamples with seed 42. These are exploratory analyses of saved predictions.</w:t>
       </w:r>
     </w:p>
     <w:p>
@@ -5141,7 +5167,7 @@
                 <w:color w:val="000000"/>
                 <w:sz w:val="21"/>
               </w:rPr>
-              <w:t xml:space="preserve">LDA-only − frozen</w:t>
+              <w:t xml:space="preserve">LDA-only – frozen</w:t>
             </w:r>
           </w:p>
         </w:tc>
@@ -5258,7 +5284,7 @@
                 <w:color w:val="000000"/>
                 <w:sz w:val="21"/>
               </w:rPr>
-              <w:t xml:space="preserve">Full refit − LDA-only</w:t>
+              <w:t xml:space="preserve">Full refit – LDA-only</w:t>
             </w:r>
           </w:p>
         </w:tc>
@@ -5375,7 +5401,7 @@
                 <w:color w:val="000000"/>
                 <w:sz w:val="21"/>
               </w:rPr>
-              <w:t xml:space="preserve">Full refit − frozen</w:t>
+              <w:t xml:space="preserve">Full refit – frozen</w:t>
             </w:r>
           </w:p>
         </w:tc>
@@ -5580,7 +5606,7 @@
           <w:color w:val="000000"/>
           <w:sz w:val="21"/>
         </w:rPr>
-        <w:t xml:space="preserve">(A) Each point gives one participant’s mean LDA-only-minus-frozen gain (horizontal) and full-minus-LDA-only gain (vertical) across five sessions. Circles show the primary cohort and open squares the development cohort; numbers identify participants. The dashed line marks zero total gain. (B) Primary-cohort session means for the full-minus-frozen and full-minus-LDA-only contrasts, with 95% participant-bootstrap intervals (12 participants; 10,000 resamples; seed 42). (C) Cohort means after deleting each indicated primary participant, with 11 participants per point; dashed lines give the original 12-participant means. The session profiles and deletion summaries describe repeated-session variation and participant influence. All values are supplied in S1 Data. Figure preparation used OpenAI ChatGPT/Codex assistance and checked numerical inputs.</w:t>
+        <w:t xml:space="preserve">(A) Each point gives one participant’s mean LDA-only-minus-frozen gain (horizontal) and full-minus-LDA-only gain (vertical) across five sessions. Circles show the primary cohort and open squares the development cohort; numbers identify participants. The dashed line marks zero total gain. (B) Primary-cohort session means for the full-minus-frozen and full-minus-LDA-only contrasts, with 95% participant-bootstrap intervals (12 participants; 10,000 resamples; seed 42). (C) Cohort means after deleting each indicated primary participant, with 11 participants per point; dashed lines give the original 12-participant means. The session profiles and deletion summaries describe repeated-session variation and participant influence. All values are supplied in S1 Data.</w:t>
       </w:r>
     </w:p>
     <w:bookmarkEnd w:id="57"/>
@@ -5711,7 +5737,16 @@
         <w:widowControl/>
       </w:pPr>
       <w:r>
-        <w:t xml:space="preserve">The development group, participant differences and session trajectories remain informative for choosing future updates. The mean component contrast was −1.15 points in development and +5.47 in the primary cohort; individual target-session gains also changed direction. These data support treating the expected benefit of an action as a distinct quantity to estimate. A useful selection target is the gain from an LDA-only or full update relative to the available alternatives, with current source/support information supplying the decision inputs.</w:t>
+        <w:t xml:space="preserve">Across all 18 participants, the secondary summary favored full refitting over LDA-only by 3.26 points and over freezing by 6.03 points. The component contrast was −1.15 points in development and +5.47 in the primary cohort. Session-level differences included a 37.50-point full-minus-LDA-only decrease for development participant sub-7 in session 2. Thus, the positive overall result coexisted with marked variation in which update performed best.</w:t>
+      </w:r>
+    </w:p>
+    <w:p>
+      <w:pPr>
+        <w:pStyle w:val="BodyText"/>
+        <w:widowControl/>
+      </w:pPr>
+      <w:r>
+        <w:t xml:space="preserve">Both update methods pooled 40 source trials with 19 or 20 current-support trials without domain weighting, an approximately 2:1 source-to-target ratio. A short support run with unstable class structure could perturb a useful source spatial representation when CSP is refitted; a spatial shift could instead leave task information poorly represented by the frozen filters. These hypotheses can be tested by relating spatial-pattern stability to paired update gains. The results motivate a session-specific decision between freezing, classifier recalibration and full refitting. Weighted covariance blending, target-only refitting and Euclidean or Riemannian alignment offer distinct alternatives for a future comparison under matched label budgets.</w:t>
       </w:r>
     </w:p>
     <w:bookmarkEnd w:id="61"/>
@@ -5772,7 +5807,25 @@
         <w:widowControl/>
       </w:pPr>
       <w:r>
-        <w:t xml:space="preserve">The present evidence comes from cue-anchored offline decoding in one 18-participant dataset, with the added decompositions and sensitivity checks treated as exploratory; phase-specific signals, independent cohorts and prospective update selection define the next validation targets, while the neural reference is tied to its recorded source-only budget.</w:t>
+        <w:t xml:space="preserve">The five-second cue-anchored windows include the approximately 1.5-second visual cue and subsequent task activity; variable online trial endings can also place feedback or post-task activity within a complete window. Strictly task-anchored windows would address a different phase-specific endpoint. The amplitude rule flagged 1,512 of 7,156 windows (21.1%) and the query sensitivity retained positive mean gains; this check addresses large query amplitudes, while potential artifacts in training/support data remain a separate issue.</w:t>
+      </w:r>
+    </w:p>
+    <w:p>
+      <w:pPr>
+        <w:pStyle w:val="FirstParagraph"/>
+        <w:widowControl/>
+      </w:pPr>
+      <w:r>
+        <w:t xml:space="preserve">Fourth-order zero-phase filtering defines an offline pipeline. Closed-loop translation requires causal preprocessing and real-time artifact handling. The unweighted source/support union fixes the information available to each update; covariance weighting and signal alignment would require their own controlled comparisons.</w:t>
+      </w:r>
+    </w:p>
+    <w:p>
+      <w:pPr>
+        <w:pStyle w:val="FirstParagraph"/>
+        <w:widowControl/>
+      </w:pPr>
+      <w:r>
+        <w:t xml:space="preserve">This study uses one 18-participant cohort, with six participants for reliability development and 12 for the primary comparison. Prediction transitions, amplitude sensitivity, influence summaries and sign-flip checks are post-hoc exploratory analyses, and earlier test-result exposure remains part of the study history. EEGNet supplies a frozen source-only reference with 20 additional source-validation labels. Independent multi-session cohorts and prospective support-driven update selection would test how well the component advantage and calibration diagnostics generalize.</w:t>
       </w:r>
     </w:p>
     <w:bookmarkEnd w:id="63"/>
@@ -5854,7 +5907,7 @@
         <w:widowControl/>
       </w:pPr>
       <w:r>
-        <w:t xml:space="preserve">Code, configurations and versioned materials are available at https://github.com/jackzhu119/few-shot-mi-eeg. The scientific results are preserved at the tag paper2-plos-source-20261016, with the institutional-exemption revision at paper2-plos-ethics-20261016. This manuscript and its supplements form the 17 October 2026 extended analysis in manuscript/plos_one_innovation_20261017/. Its README identifies the source versions, new prediction-transition code, figure inputs and generated files. S1 Data includes the original saved-result package together with the new component analyses and complete cohort tables.</w:t>
+        <w:t xml:space="preserve">Code, configurations and versioned materials are available at https://github.com/jackzhu119/few-shot-mi-eeg. The scientific results are preserved at the tag paper2-plos-source-20261016, with the earlier ethics wording preserved at paper2-plos-ethics-20261016; S2 Text gives the current regulatory exemption statement. This manuscript and its supplements form the 17 October 2026 extended analysis in manuscript/plos_one_innovation_20261017/. Its README identifies the source versions, new prediction-transition code, figure inputs and generated files. S1 Data includes the original saved-result package together with the new component analyses and complete cohort tables.</w:t>
       </w:r>
     </w:p>
     <w:p>
@@ -6926,7 +6979,7 @@
         <w:rPr>
           <w:sz w:val="21"/>
         </w:rPr>
-        <w:t xml:space="preserve">	</w:t>
+        <w:t xml:space="preserve">	EEG event codebook: </w:t>
       </w:r>
       <w:r>
         <w:rPr>
@@ -6938,7 +6991,7 @@
         <w:rPr>
           <w:sz w:val="21"/>
         </w:rPr>
-        <w:t xml:space="preserve">. Author-supplied codebook in the TransLearning repository; Available:</w:t>
+        <w:t xml:space="preserve">. TransLearning repository [Internet]; GitHub; [cited 19 Oct 2026]. Available:</w:t>
       </w:r>
       <w:r>
         <w:rPr>

</xml_diff>

<commit_message>
Clarify targeted manuscript wording and preserve verified recall intervals
Verify that the original right-recall interval is 9.91 [-1.46, 21.75] and leave all table values unchanged. Apply only reviewed terminology, scope, availability and verification-language edits, synchronize the two main Word/PDF exports and update their submission containers. Preserve supplements, figures, references, ethics and scientific inputs byte-for-byte.
</commit_message>
<xml_diff>
--- a/manuscript/plos_one_innovation_20261017/PLOS_ONE_Manuscript_Reading.docx
+++ b/manuscript/plos_one_innovation_20261017/PLOS_ONE_Manuscript_Reading.docx
@@ -818,7 +818,7 @@
         <w:widowControl/>
       </w:pPr>
       <w:r>
-        <w:t xml:space="preserve">The CPU pipeline combined four-component CSP with Ledoit–Wolf covariance regularization, log mean-square features and norm_trace=False, followed by shrinkage LDA (solver=lsqr, automatic shrinkage)</w:t>
+        <w:t xml:space="preserve">The CSP/LDA pipeline combined four-component CSP with Ledoit–Wolf covariance regularization, log mean-square features and norm_trace=False, followed by shrinkage LDA (solver=lsqr, automatic shrinkage)</w:t>
       </w:r>
       <w:r>
         <w:t xml:space="preserve"> </w:t>
@@ -838,7 +838,7 @@
         <w:t xml:space="preserve">]</w:t>
       </w:r>
       <w:r>
-        <w:t xml:space="preserve">. A single configuration defined all CPU comparisons:</w:t>
+        <w:t xml:space="preserve">. A single configuration defined all CSP/LDA comparisons:</w:t>
       </w:r>
     </w:p>
     <w:p>
@@ -916,7 +916,7 @@
         <w:widowControl/>
       </w:pPr>
       <w:r>
-        <w:t xml:space="preserve">CPU fitting and parameter selection used training/support identities exclusively. The identical labeled fitting sets in the two updating methods make their contrast a direct comparison of the added spatial-filter update within CSP/LDA.</w:t>
+        <w:t xml:space="preserve">CSP/LDA fitting and parameter selection used training/support identities exclusively. The identical labeled fitting sets in the two updating methods make their contrast a direct comparison of the added spatial-filter update within CSP/LDA.</w:t>
       </w:r>
     </w:p>
     <w:p>
@@ -1608,7 +1608,7 @@
         <w:widowControl/>
       </w:pPr>
       <w:r>
-        <w:t xml:space="preserve">The two CPU update methods share the adaptation budget. Their comparison with freezing measures the benefit of adding support labels and refitting the specified components. Frozen EEGNet supplies a source-only neural reference with the additional validation budget shown in Table 1. Target-session neural fine-tuning would add layer-freezing and learning-rate choices for 19 or 20 support trials; retaining the frozen reference keeps the adaptation comparison focused on the CSP and LDA stages. S1 Text, S3 gives the complete implementation settings.</w:t>
+        <w:t xml:space="preserve">The two CSP/LDA update methods share the adaptation budget. Their comparison with freezing measures the benefit of adding support labels and refitting the specified components. Frozen EEGNet supplies a source-only neural reference with the additional validation budget shown in Table 1. Target-session neural fine-tuning would add layer-freezing and learning-rate choices for 19 or 20 support trials; retaining the frozen reference keeps the adaptation comparison focused on the CSP and LDA stages. S1 Text, S3 gives the complete implementation settings.</w:t>
       </w:r>
     </w:p>
     <w:bookmarkEnd w:id="25"/>
@@ -1827,7 +1827,7 @@
         <w:widowControl/>
       </w:pPr>
       <w:r>
-        <w:t xml:space="preserve">We added an exploratory analysis of the saved CPU predictions to explain how each update changed class decisions. For two methods A and B evaluated on the same trials, the correction contribution was one half of the sum, over the two true classes, of the fraction classified incorrectly by A and correctly by B. The introduced-error contribution used the reverse transition. Their difference equals BA(B) − BA(A) exactly. We computed all three contrasts: frozen to LDA-only, LDA-only to full refitting, and frozen to full refitting. Left- and right-class recalls were also analyzed separately.</w:t>
+        <w:t xml:space="preserve">We added an exploratory analysis of the saved CSP/LDA predictions to explain how each update changed class decisions. For two methods A and B evaluated on the same trials, the correction contribution was one half of the sum, over the two true classes, of the fraction classified incorrectly by A and correctly by B. The introduced-error contribution used the reverse transition. Their difference equals BA(B) − BA(A) exactly. We computed all three contrasts: frozen to LDA-only, LDA-only to full refitting, and frozen to full refitting. Left- and right-class recalls were also analyzed separately.</w:t>
       </w:r>
     </w:p>
     <w:p>
@@ -1871,7 +1871,7 @@
         <w:widowControl/>
       </w:pPr>
       <w:r>
-        <w:t xml:space="preserve">OpenAI ChatGPT/Codex assisted with software, validation, saved-result aggregation, figures, source and reference checks, manuscript drafting and editing, and document exports. Verification included trial-identity joins and hashes, reconstruction of the original endpoints, independent implementations of the prediction-transition arithmetic, public-input replay, and visual review of the documents and figures. The software and editorial checks were AI-assisted. The author is responsible for the manuscript’s content.</w:t>
+        <w:t xml:space="preserve">OpenAI ChatGPT/Codex assisted with software, validation, saved-result aggregation, figures, source and reference checks, manuscript drafting and editing, and document exports. Verification included exact trial-identifier matching and file checksums, reconstruction of the original endpoints from saved predictions, independent implementations of the prediction-transition arithmetic, reproduction of saved-result calculations from the shared predictions and trial metadata, and visual review of the documents and figures. The software and editorial checks were AI-assisted. The author is responsible for the manuscript’s content.</w:t>
       </w:r>
     </w:p>
     <w:bookmarkEnd w:id="30"/>
@@ -2751,7 +2751,7 @@
           <w:color w:val="000000"/>
           <w:sz w:val="21"/>
         </w:rPr>
-        <w:t xml:space="preserve">(A) Six development participants. (B) Twelve primary participants. Each colored point represents one participant’s mean BA over five target sessions; faint lines connect the same participant across methods. EEGNet averages three seeds within session. Diamonds and bars show cohort means and 95% participant-bootstrap intervals (10,000 resamples, seed 42). All methods were evaluated on the same query identities. The two CPU updating methods used identical source-training and current-support labels; the other information budgets are given in Table 1.</w:t>
+        <w:t xml:space="preserve">(A) Six development participants. (B) Twelve primary participants. Each colored point represents one participant’s mean BA over five target sessions; faint lines connect the same participant across methods. EEGNet averages three seeds within session. Diamonds and bars show cohort means and 95% participant-bootstrap intervals (10,000 resamples, seed 42). All methods were evaluated on the same query identities. The two CSP/LDA updating methods used identical source-training and current-support labels; the other information budgets are given in Table 1.</w:t>
       </w:r>
     </w:p>
     <w:bookmarkEnd w:id="35"/>
@@ -2904,7 +2904,7 @@
         <w:widowControl/>
       </w:pPr>
       <w:r>
-        <w:t xml:space="preserve">All 54 scheduled EEGNet fits contributed to the source-only neural reference. Primary-cohort BA was 52.92% on held-out source query and 51.58% across target sessions; the corresponding CPU source-query BA was 65.00% (Table 3).</w:t>
+        <w:t xml:space="preserve">All 54 scheduled EEGNet fits contributed to the source-only neural reference. Primary-cohort BA was 52.92% on held-out source query and 51.58% across target sessions; the corresponding CSP/LDA source-query BA was 65.00% (Table 3).</w:t>
       </w:r>
     </w:p>
     <w:p>
@@ -3035,7 +3035,7 @@
                 <w:color w:val="000000"/>
                 <w:sz w:val="21"/>
               </w:rPr>
-              <w:t xml:space="preserve">CPU source model, shared across the three update conditions</w:t>
+              <w:t xml:space="preserve">CSP/LDA source model, shared across the three update conditions</w:t>
             </w:r>
           </w:p>
         </w:tc>
@@ -5807,7 +5807,7 @@
         <w:widowControl/>
       </w:pPr>
       <w:r>
-        <w:t xml:space="preserve">The five-second cue-anchored windows include the approximately 1.5-second visual cue and subsequent task activity; variable online trial endings can also place feedback or post-task activity within a complete window. Strictly task-anchored windows would address a different phase-specific endpoint. The amplitude rule flagged 1,512 of 7,156 windows (21.1%) and the query sensitivity retained positive mean gains; this check addresses large query amplitudes, while potential artifacts in training/support data remain a separate issue.</w:t>
+        <w:t xml:space="preserve">The five-second cue-anchored windows span the approximately 1.5-second visual cue and subsequent task activity, while variable online trial endings can place feedback or post-task activity within a complete window. Restricting evaluation to strictly task-anchored intervals would therefore address a different, phase-specific endpoint. The amplitude rule flagged 1,512 of 7,156 complete windows (21.1%); the query sensitivity retained positive mean gains after restricting evaluation to unflagged queries. This addresses large query amplitudes, with potential artifacts in training/support data remaining a separate issue.</w:t>
       </w:r>
     </w:p>
     <w:p>
@@ -5816,7 +5816,7 @@
         <w:widowControl/>
       </w:pPr>
       <w:r>
-        <w:t xml:space="preserve">Fourth-order zero-phase filtering defines an offline pipeline. Closed-loop translation requires causal preprocessing and real-time artifact handling. The unweighted source/support union fixes the information available to each update; covariance weighting and signal alignment would require their own controlled comparisons.</w:t>
+        <w:t xml:space="preserve">These comparisons use fourth-order zero-phase filtering for offline analysis, whereas closed-loop translation requires causal preprocessing and real-time artifact handling. Both update methods pooled source/support data without weighting to fix the information available for adaptation; covariance weighting and signal alignment would require their own controlled comparisons.</w:t>
       </w:r>
     </w:p>
     <w:p>
@@ -5825,7 +5825,7 @@
         <w:widowControl/>
       </w:pPr>
       <w:r>
-        <w:t xml:space="preserve">This study uses one 18-participant cohort, with six participants for reliability development and 12 for the primary comparison. Prediction transitions, amplitude sensitivity, influence summaries and sign-flip checks are post-hoc exploratory analyses, and earlier test-result exposure remains part of the study history. EEGNet supplies a frozen source-only reference with 20 additional source-validation labels. Independent multi-session cohorts and prospective support-driven update selection would test how well the component advantage and calibration diagnostics generalize.</w:t>
+        <w:t xml:space="preserve">The findings come from one 18-participant cohort, partitioned into six participants for reliability development and 12 for the primary comparison. The primary endpoint hierarchy and cohort split were predefined; prediction transitions, amplitude sensitivity, participant-influence summaries and exact sign-flip checks were conducted as post-hoc exploratory analyses after observing the original decoding results. EEGNet supplies a frozen source-only reference with 20 additional source-validation labels. Independent multi-session cohorts and prospective support-driven update selection would test how well the component advantage and calibration diagnostics generalize.</w:t>
       </w:r>
     </w:p>
     <w:bookmarkEnd w:id="63"/>
@@ -5907,7 +5907,7 @@
         <w:widowControl/>
       </w:pPr>
       <w:r>
-        <w:t xml:space="preserve">Code, configurations and versioned materials are available at https://github.com/jackzhu119/few-shot-mi-eeg. The scientific results are preserved at the tag paper2-plos-source-20261016, with the earlier ethics wording preserved at paper2-plos-ethics-20261016; S2 Text gives the current regulatory exemption statement. This manuscript and its supplements form the 17 October 2026 extended analysis in manuscript/plos_one_innovation_20261017/. Its README identifies the source versions, new prediction-transition code, figure inputs and generated files. S1 Data includes the original saved-result package together with the new component analyses and complete cohort tables.</w:t>
+        <w:t xml:space="preserve">Analysis code, configuration files and reproducibility instructions are publicly available at https://github.com/jackzhu119/few-shot-mi-eeg. The versioned manuscript README identifies the fixed source revisions, prediction-transition scripts, figure-generation inputs and generated files. S1 Data archives the complete saved-result package together with the prediction-transition analyses and cohort summary tables.</w:t>
       </w:r>
     </w:p>
     <w:p>

</xml_diff>